<commit_message>
docs(architecture): keep only final report deliverables
Summary:
- Reduce the tracked architecture report package from 33 files to seven.

Details:
- Preserve extra exports and working sources in an ignored local folder.
- Keep Word, PDF, Markdown, the data dictionary and two final PNGs.
- Repair report references and add the report to the project guide index.
- Align database bootstrap guidance with the verified metadata limitation.
- Preserve earlier commits as requested.

Validation:
- Checked 25 local documentation links.
- Rendered the 16-page report and inspected the changed reference page.
- Confirmed the other 15 page images match the previously reviewed version.
- Document accessibility audit reported no issues.
- Verified no semicolons in visible report text.
- Checked the seven-file staged report inventory and whitespace.
</commit_message>
<xml_diff>
--- a/docs/reports/iteration-2-architecture/AI-Wrevolusi-Iteration-2-System-Architecture-Report.docx
+++ b/docs/reports/iteration-2-architecture/AI-Wrevolusi-Iteration-2-System-Architecture-Report.docx
@@ -4491,7 +4491,7 @@
     <w:p>
       <w:pPr/>
       <w:r>
-        <w:t>Repository references use the current code baseline aa4f8fb unless an earlier ref is shown. The source folder beside this report includes the detailed history evidence, schema inventory and a rebuild script.</w:t>
+        <w:t>Repository references use the current code baseline aa4f8fb unless an earlier ref is shown. The report text and full data dictionary are included beside the Word and PDF copies. Earlier code can be checked using the Git references listed below.</w:t>
       </w:r>
     </w:p>
     <w:tbl>
@@ -4706,7 +4706,7 @@
                 <w:color w:val="17324D"/>
                 <w:sz w:val="19"/>
               </w:rPr>
-              <w:t>Dates, release snapshots and frontend ownership changes. See source/history-evidence.md for exact files and lines.</w:t>
+              <w:t>Dates, release snapshots and frontend ownership changes. The named Git references preserve the earlier source versions.</w:t>
             </w:r>
           </w:p>
         </w:tc>
@@ -5300,7 +5300,7 @@
               <w:br/>
               <w:t>backend/alembic/versions/</w:t>
               <w:br/>
-              <w:t>source/schema-evidence.json</w:t>
+              <w:t>Data-Dictionary.md</w:t>
             </w:r>
           </w:p>
         </w:tc>

</xml_diff>